<commit_message>
Atualiza as evidencias da nova execucao dos testes
Os tres cenarios de saida foram executados de novo, com a API no ar e o banco no saldo inicial. As evidencias e o resultados.docx passam a refletir essa execucao.
</commit_message>
<xml_diff>
--- a/resultados.docx
+++ b/resultados.docx
@@ -1625,7 +1625,7 @@
                 <w:sz w:val="20"/>
                 <w:szCs w:val="20"/>
               </w:rPr>
-              <w:t xml:space="preserve">Corpo: mensagem "Saida registrada com sucesso", id_movimentacao 4, data_hora "2026-10-23T12:23:23.396Z", responsavel "Otavio Operador", quantidade_atual 0.</w:t>
+              <w:t xml:space="preserve">Corpo: mensagem "Saida registrada com sucesso", id_movimentacao 4, data_hora "2026-10-23T12:30:32.528Z", responsavel "Otavio Operador", quantidade_atual 0.</w:t>
             </w:r>
           </w:p>
           <w:p>
@@ -2531,7 +2531,7 @@
                 <w:sz w:val="20"/>
                 <w:szCs w:val="20"/>
               </w:rPr>
-              <w:t xml:space="preserve">Corpo: mensagem "Saida registrada com sucesso", id_movimentacao 5, data_hora "2026-10-23T12:23:23.407Z", responsavel "Otavio Operador", quantidade_atual 6.</w:t>
+              <w:t xml:space="preserve">Corpo: mensagem "Saida registrada com sucesso", id_movimentacao 5, data_hora "2026-10-23T12:30:32.538Z", responsavel "Otavio Operador", quantidade_atual 6.</w:t>
             </w:r>
           </w:p>
           <w:p>

</xml_diff>